<commit_message>
Refine snapshot copy and use real CV assets
</commit_message>
<xml_diff>
--- a/assets/cv/andrew_balmer_cv.docx
+++ b/assets/cv/andrew_balmer_cv.docx
@@ -24,7 +24,7 @@
           <w:szCs w:val="32"/>
         </w:rPr>
         <w:drawing>
-          <wp:anchor distT="0" distB="0" distL="114300" distR="114300" simplePos="0" relativeHeight="251658240" behindDoc="0" locked="0" layoutInCell="1" allowOverlap="1" wp14:anchorId="79496492" wp14:editId="715CFA6B">
+          <wp:anchor distT="0" distB="0" distL="114300" distR="114300" simplePos="0" relativeHeight="251658240" behindDoc="0" locked="0" layoutInCell="1" allowOverlap="1" wp14:anchorId="79496492" wp14:editId="60583CCE">
             <wp:simplePos x="0" y="0"/>
             <wp:positionH relativeFrom="column">
               <wp:posOffset>-46990</wp:posOffset>
@@ -204,10 +204,41 @@
         <w:jc w:val="center"/>
         <w:rPr>
           <w:rFonts w:ascii="Arial" w:hAnsi="Arial" w:cs="Arial"/>
-          <w:sz w:val="20"/>
-          <w:szCs w:val="20"/>
-        </w:rPr>
-      </w:pPr>
+          <w:b/>
+          <w:sz w:val="20"/>
+          <w:szCs w:val="20"/>
+        </w:rPr>
+      </w:pPr>
+    </w:p>
+    <w:p>
+      <w:pPr>
+        <w:pStyle w:val="p1"/>
+        <w:spacing w:before="0" w:beforeAutospacing="0" w:after="0" w:afterAutospacing="0" w:line="288" w:lineRule="auto"/>
+        <w:jc w:val="center"/>
+        <w:rPr>
+          <w:rFonts w:ascii="Arial" w:hAnsi="Arial" w:cs="Arial"/>
+          <w:sz w:val="20"/>
+          <w:szCs w:val="20"/>
+        </w:rPr>
+      </w:pPr>
+      <w:r>
+        <w:rPr>
+          <w:rFonts w:ascii="Arial" w:hAnsi="Arial" w:cs="Arial"/>
+          <w:b/>
+          <w:sz w:val="20"/>
+          <w:szCs w:val="20"/>
+        </w:rPr>
+        <w:t>Microbial</w:t>
+      </w:r>
+      <w:r>
+        <w:rPr>
+          <w:rFonts w:ascii="Arial" w:hAnsi="Arial" w:cs="Arial"/>
+          <w:b/>
+          <w:sz w:val="20"/>
+          <w:szCs w:val="20"/>
+        </w:rPr>
+        <w:t xml:space="preserve"> Genomics </w:t>
+      </w:r>
       <w:r>
         <w:rPr>
           <w:rFonts w:ascii="Arial" w:hAnsi="Arial" w:cs="Arial"/>
@@ -215,23 +246,7 @@
           <w:sz w:val="20"/>
           <w:szCs w:val="20"/>
         </w:rPr>
-        <w:t xml:space="preserve">Quantitative Analysis </w:t>
-      </w:r>
-      <w:r>
-        <w:rPr>
-          <w:rFonts w:ascii="Arial" w:hAnsi="Arial" w:cs="Arial"/>
-          <w:sz w:val="20"/>
-          <w:szCs w:val="20"/>
-        </w:rPr>
-        <w:t>·</w:t>
-      </w:r>
-      <w:r>
-        <w:rPr>
-          <w:rFonts w:ascii="Arial" w:hAnsi="Arial" w:cs="Arial"/>
-          <w:sz w:val="20"/>
-          <w:szCs w:val="20"/>
-        </w:rPr>
-        <w:t xml:space="preserve"> </w:t>
+        <w:t xml:space="preserve">| </w:t>
       </w:r>
       <w:r>
         <w:rPr>
@@ -240,7 +255,7 @@
           <w:sz w:val="20"/>
           <w:szCs w:val="20"/>
         </w:rPr>
-        <w:t xml:space="preserve">Public Health </w:t>
+        <w:t xml:space="preserve">Computational Biology </w:t>
       </w:r>
       <w:r>
         <w:rPr>
@@ -249,14 +264,6 @@
           <w:szCs w:val="20"/>
         </w:rPr>
         <w:t>·</w:t>
-      </w:r>
-      <w:r>
-        <w:rPr>
-          <w:rFonts w:ascii="Arial" w:hAnsi="Arial" w:cs="Arial"/>
-          <w:sz w:val="20"/>
-          <w:szCs w:val="20"/>
-        </w:rPr>
-        <w:t xml:space="preserve"> </w:t>
       </w:r>
       <w:r>
         <w:rPr>
@@ -265,22 +272,6 @@
           <w:sz w:val="20"/>
           <w:szCs w:val="20"/>
         </w:rPr>
-        <w:t xml:space="preserve">Infectious Disease Modelling </w:t>
-      </w:r>
-      <w:r>
-        <w:rPr>
-          <w:rFonts w:ascii="Arial" w:hAnsi="Arial" w:cs="Arial"/>
-          <w:sz w:val="20"/>
-          <w:szCs w:val="20"/>
-        </w:rPr>
-        <w:t>·</w:t>
-      </w:r>
-      <w:r>
-        <w:rPr>
-          <w:rFonts w:ascii="Arial" w:hAnsi="Arial" w:cs="Arial"/>
-          <w:sz w:val="20"/>
-          <w:szCs w:val="20"/>
-        </w:rPr>
         <w:t xml:space="preserve"> </w:t>
       </w:r>
       <w:r>
@@ -290,7 +281,50 @@
           <w:sz w:val="20"/>
           <w:szCs w:val="20"/>
         </w:rPr>
-        <w:t>Evidence Synthesis</w:t>
+        <w:t xml:space="preserve">Open-Source </w:t>
+      </w:r>
+      <w:r>
+        <w:rPr>
+          <w:rFonts w:ascii="Arial" w:hAnsi="Arial" w:cs="Arial"/>
+          <w:bCs/>
+          <w:sz w:val="20"/>
+          <w:szCs w:val="20"/>
+        </w:rPr>
+        <w:t>Methods</w:t>
+      </w:r>
+      <w:r>
+        <w:rPr>
+          <w:rFonts w:ascii="Arial" w:hAnsi="Arial" w:cs="Arial"/>
+          <w:bCs/>
+          <w:sz w:val="20"/>
+          <w:szCs w:val="20"/>
+        </w:rPr>
+        <w:t xml:space="preserve"> Development </w:t>
+      </w:r>
+      <w:r>
+        <w:rPr>
+          <w:rFonts w:ascii="Arial" w:hAnsi="Arial" w:cs="Arial"/>
+          <w:sz w:val="20"/>
+          <w:szCs w:val="20"/>
+        </w:rPr>
+        <w:t>·</w:t>
+      </w:r>
+      <w:r>
+        <w:rPr>
+          <w:rFonts w:ascii="Arial" w:hAnsi="Arial" w:cs="Arial"/>
+          <w:sz w:val="20"/>
+          <w:szCs w:val="20"/>
+        </w:rPr>
+        <w:t xml:space="preserve"> </w:t>
+      </w:r>
+      <w:r>
+        <w:rPr>
+          <w:rFonts w:ascii="Arial" w:hAnsi="Arial" w:cs="Arial"/>
+          <w:bCs/>
+          <w:sz w:val="20"/>
+          <w:szCs w:val="20"/>
+        </w:rPr>
+        <w:t>Bioinformatics</w:t>
       </w:r>
     </w:p>
     <w:p>
@@ -487,36 +521,6 @@
     </w:p>
     <w:p>
       <w:pPr>
-        <w:pStyle w:val="ListParagraph"/>
-        <w:numPr>
-          <w:ilvl w:val="0"/>
-          <w:numId w:val="19"/>
-        </w:numPr>
-        <w:spacing w:after="0" w:line="240" w:lineRule="auto"/>
-        <w:jc w:val="left"/>
-        <w:rPr>
-          <w:rFonts w:eastAsia="Times New Roman" w:cs="Arial"/>
-          <w:color w:val="0E0E0E"/>
-          <w:kern w:val="0"/>
-          <w:szCs w:val="20"/>
-          <w:lang w:val="en-US" w:eastAsia="en-US"/>
-          <w14:ligatures w14:val="none"/>
-        </w:rPr>
-      </w:pPr>
-      <w:r>
-        <w:rPr>
-          <w:rFonts w:eastAsia="Times New Roman" w:cs="Arial"/>
-          <w:color w:val="0E0E0E"/>
-          <w:kern w:val="0"/>
-          <w:szCs w:val="20"/>
-          <w:lang w:val="en-US" w:eastAsia="en-US"/>
-          <w14:ligatures w14:val="none"/>
-        </w:rPr>
-        <w:t>Developed quantitative and statistical frameworks for modelling pathogen evolution and resistance dynamics.</w:t>
-      </w:r>
-    </w:p>
-    <w:p>
-      <w:pPr>
         <w:spacing w:after="0" w:line="288" w:lineRule="auto"/>
         <w:ind w:left="0" w:right="6" w:firstLine="0"/>
       </w:pPr>
@@ -807,7 +811,6 @@
           <w:numId w:val="24"/>
         </w:numPr>
         <w:spacing w:before="0" w:beforeAutospacing="0" w:after="0" w:afterAutospacing="0" w:line="288" w:lineRule="auto"/>
-        <w:ind w:left="389"/>
         <w:jc w:val="both"/>
         <w:rPr>
           <w:rFonts w:ascii="Arial" w:hAnsi="Arial" w:cs="Arial"/>
@@ -897,7 +900,7 @@
           <w:sz w:val="20"/>
           <w:szCs w:val="20"/>
         </w:rPr>
-        <w:t>samples</w:t>
+        <w:t>genomes</w:t>
       </w:r>
       <w:r>
         <w:rPr>
@@ -943,6 +946,7 @@
           <w14:ligatures w14:val="none"/>
         </w:rPr>
       </w:pPr>
+      <w:proofErr w:type="spellStart"/>
       <w:r>
         <w:rPr>
           <w:rFonts w:eastAsia="Times New Roman" w:cs="Arial"/>
@@ -952,7 +956,41 @@
           <w:lang w:val="en-US" w:eastAsia="en-US"/>
           <w14:ligatures w14:val="none"/>
         </w:rPr>
-        <w:t>Performed large-scale statistical modelling and sensitivity analyses to evaluate evidence strength and estimate intervention impact.</w:t>
+        <w:t>Analysed</w:t>
+      </w:r>
+      <w:proofErr w:type="spellEnd"/>
+      <w:r>
+        <w:rPr>
+          <w:rFonts w:eastAsia="Times New Roman" w:cs="Arial"/>
+          <w:color w:val="0E0E0E"/>
+          <w:kern w:val="0"/>
+          <w:szCs w:val="20"/>
+          <w:lang w:val="en-US" w:eastAsia="en-US"/>
+          <w14:ligatures w14:val="none"/>
+        </w:rPr>
+        <w:t xml:space="preserve"> population-scale microbial datasets, including heterogeneous samples, integrating epidemiological metadata to study pathogen dynamics over time and across spa</w:t>
+      </w:r>
+      <w:r>
+        <w:rPr>
+          <w:rFonts w:eastAsia="Times New Roman" w:cs="Arial"/>
+          <w:color w:val="0E0E0E"/>
+          <w:kern w:val="0"/>
+          <w:szCs w:val="20"/>
+          <w:lang w:val="en-US" w:eastAsia="en-US"/>
+          <w14:ligatures w14:val="none"/>
+        </w:rPr>
+        <w:t>ce</w:t>
+      </w:r>
+      <w:r>
+        <w:rPr>
+          <w:rFonts w:eastAsia="Times New Roman" w:cs="Arial"/>
+          <w:color w:val="0E0E0E"/>
+          <w:kern w:val="0"/>
+          <w:szCs w:val="20"/>
+          <w:lang w:val="en-US" w:eastAsia="en-US"/>
+          <w14:ligatures w14:val="none"/>
+        </w:rPr>
+        <w:t>.</w:t>
       </w:r>
     </w:p>
     <w:p>
@@ -963,6 +1001,37 @@
           <w:numId w:val="24"/>
         </w:numPr>
         <w:spacing w:after="0" w:line="288" w:lineRule="auto"/>
+        <w:jc w:val="left"/>
+        <w:rPr>
+          <w:rFonts w:eastAsia="Times New Roman" w:cs="Arial"/>
+          <w:color w:val="0E0E0E"/>
+          <w:kern w:val="0"/>
+          <w:szCs w:val="20"/>
+          <w:lang w:val="en-US" w:eastAsia="en-US"/>
+          <w14:ligatures w14:val="none"/>
+        </w:rPr>
+      </w:pPr>
+      <w:r>
+        <w:rPr>
+          <w:rFonts w:eastAsia="Times New Roman" w:cs="Arial"/>
+          <w:color w:val="0E0E0E"/>
+          <w:kern w:val="0"/>
+          <w:szCs w:val="20"/>
+          <w:lang w:val="en-US" w:eastAsia="en-US"/>
+          <w14:ligatures w14:val="none"/>
+        </w:rPr>
+        <w:t>Developed and adapted computational methods and scalable pipelines for handling complex microbial sequencing data—skills directly transferable to metagenomic workflows.</w:t>
+      </w:r>
+    </w:p>
+    <w:p>
+      <w:pPr>
+        <w:pStyle w:val="ListParagraph"/>
+        <w:numPr>
+          <w:ilvl w:val="0"/>
+          <w:numId w:val="24"/>
+        </w:numPr>
+        <w:spacing w:after="0" w:line="288" w:lineRule="auto"/>
+        <w:ind w:left="389"/>
         <w:jc w:val="left"/>
         <w:rPr>
           <w:rFonts w:eastAsia="Times New Roman" w:cs="Arial"/>
@@ -1088,10 +1157,10 @@
           <w:numId w:val="24"/>
         </w:numPr>
         <w:spacing w:before="0" w:beforeAutospacing="0" w:after="0" w:afterAutospacing="0" w:line="288" w:lineRule="auto"/>
+        <w:ind w:left="389"/>
         <w:jc w:val="both"/>
         <w:rPr>
           <w:rFonts w:ascii="Arial" w:hAnsi="Arial" w:cs="Arial"/>
-          <w:color w:val="000000" w:themeColor="text1"/>
           <w:sz w:val="20"/>
           <w:szCs w:val="20"/>
         </w:rPr>
@@ -1099,65 +1168,42 @@
       <w:r>
         <w:rPr>
           <w:rFonts w:ascii="Arial" w:hAnsi="Arial" w:cs="Arial"/>
-          <w:color w:val="000000" w:themeColor="text1"/>
-          <w:sz w:val="20"/>
-          <w:szCs w:val="20"/>
-        </w:rPr>
-        <w:t xml:space="preserve">Built scalable </w:t>
+          <w:sz w:val="20"/>
+          <w:szCs w:val="20"/>
+        </w:rPr>
+        <w:t>Co-led grant development</w:t>
       </w:r>
       <w:r>
         <w:rPr>
           <w:rFonts w:ascii="Arial" w:hAnsi="Arial" w:cs="Arial"/>
-          <w:color w:val="000000" w:themeColor="text1"/>
-          <w:sz w:val="20"/>
-          <w:szCs w:val="20"/>
-        </w:rPr>
-        <w:t xml:space="preserve">bioinformatics </w:t>
+          <w:sz w:val="20"/>
+          <w:szCs w:val="20"/>
+        </w:rPr>
+        <w:t>/</w:t>
       </w:r>
       <w:r>
         <w:rPr>
           <w:rFonts w:ascii="Arial" w:hAnsi="Arial" w:cs="Arial"/>
-          <w:color w:val="000000" w:themeColor="text1"/>
-          <w:sz w:val="20"/>
-          <w:szCs w:val="20"/>
-        </w:rPr>
-        <w:t xml:space="preserve">pipelines for </w:t>
+          <w:sz w:val="20"/>
+          <w:szCs w:val="20"/>
+        </w:rPr>
+        <w:t xml:space="preserve">research strategy </w:t>
       </w:r>
       <w:r>
         <w:rPr>
           <w:rFonts w:ascii="Arial" w:hAnsi="Arial" w:cs="Arial"/>
-          <w:color w:val="000000" w:themeColor="text1"/>
-          <w:sz w:val="20"/>
-          <w:szCs w:val="20"/>
-        </w:rPr>
-        <w:t xml:space="preserve">vaccine discovery </w:t>
+          <w:sz w:val="20"/>
+          <w:szCs w:val="20"/>
+        </w:rPr>
+        <w:t xml:space="preserve">with </w:t>
       </w:r>
       <w:r>
         <w:rPr>
           <w:rFonts w:ascii="Arial" w:hAnsi="Arial" w:cs="Arial"/>
-          <w:color w:val="000000" w:themeColor="text1"/>
-          <w:sz w:val="20"/>
-          <w:szCs w:val="20"/>
-        </w:rPr>
-        <w:t xml:space="preserve">and </w:t>
-      </w:r>
-      <w:r>
-        <w:rPr>
-          <w:rFonts w:ascii="Arial" w:hAnsi="Arial" w:cs="Arial"/>
-          <w:color w:val="000000" w:themeColor="text1"/>
-          <w:sz w:val="20"/>
-          <w:szCs w:val="20"/>
-        </w:rPr>
-        <w:t xml:space="preserve">population </w:t>
-      </w:r>
-      <w:r>
-        <w:rPr>
-          <w:rFonts w:ascii="Arial" w:hAnsi="Arial" w:cs="Arial"/>
-          <w:color w:val="000000" w:themeColor="text1"/>
-          <w:sz w:val="20"/>
-          <w:szCs w:val="20"/>
-        </w:rPr>
-        <w:t>genomic inference.</w:t>
+          <w:sz w:val="20"/>
+          <w:szCs w:val="20"/>
+        </w:rPr>
+        <w:t>funders and international collaborators.</w:t>
       </w:r>
     </w:p>
     <w:p>
@@ -1196,82 +1242,27 @@
     </w:p>
     <w:p>
       <w:pPr>
-        <w:pStyle w:val="ListParagraph"/>
+        <w:pStyle w:val="p1"/>
         <w:numPr>
           <w:ilvl w:val="0"/>
           <w:numId w:val="13"/>
         </w:numPr>
-        <w:spacing w:after="0" w:line="288" w:lineRule="auto"/>
-        <w:rPr>
-          <w:rFonts w:cs="Arial"/>
-          <w:szCs w:val="20"/>
-        </w:rPr>
-      </w:pPr>
-      <w:r>
-        <w:rPr>
-          <w:rFonts w:cs="Arial"/>
-          <w:szCs w:val="20"/>
-        </w:rPr>
-        <w:t xml:space="preserve">Pioneered </w:t>
-      </w:r>
-      <w:r>
-        <w:rPr>
-          <w:rFonts w:cs="Arial"/>
-          <w:color w:val="0070C0"/>
-          <w:szCs w:val="20"/>
-        </w:rPr>
-        <w:t>‘</w:t>
-      </w:r>
-      <w:hyperlink r:id="rId15" w:history="1">
-        <w:r>
-          <w:rPr>
-            <w:rStyle w:val="Hyperlink"/>
-            <w:rFonts w:cs="Arial"/>
-            <w:color w:val="0070C0"/>
-            <w:szCs w:val="20"/>
-          </w:rPr>
-          <w:t>Antimicrobial Resistance Cartography’</w:t>
-        </w:r>
-      </w:hyperlink>
-      <w:r>
-        <w:rPr>
-          <w:rFonts w:cs="Arial"/>
-          <w:szCs w:val="20"/>
-        </w:rPr>
-        <w:t xml:space="preserve"> framework—a novel computational approach to model multivariate drug resistance phenotypes at population scales</w:t>
-      </w:r>
-      <w:r>
-        <w:rPr>
-          <w:rFonts w:eastAsia="Times New Roman" w:cs="Arial"/>
-          <w:color w:val="0E0E0E"/>
-          <w:kern w:val="0"/>
-          <w:szCs w:val="20"/>
-          <w:lang w:val="en-US" w:eastAsia="en-US"/>
-          <w14:ligatures w14:val="none"/>
-        </w:rPr>
-        <w:t xml:space="preserve">, incorporating </w:t>
-      </w:r>
-      <w:r>
-        <w:rPr>
-          <w:rFonts w:eastAsia="Times New Roman" w:cs="Arial"/>
-          <w:color w:val="0E0E0E"/>
-          <w:kern w:val="0"/>
-          <w:szCs w:val="20"/>
-          <w:lang w:val="en-US" w:eastAsia="en-US"/>
-          <w14:ligatures w14:val="none"/>
-        </w:rPr>
-        <w:tab/>
-      </w:r>
-      <w:r>
-        <w:rPr>
-          <w:rFonts w:eastAsia="Times New Roman" w:cs="Arial"/>
-          <w:color w:val="0E0E0E"/>
-          <w:kern w:val="0"/>
-          <w:szCs w:val="20"/>
-          <w:lang w:val="en-US" w:eastAsia="en-US"/>
-          <w14:ligatures w14:val="none"/>
-        </w:rPr>
-        <w:t>statistical validation, uncertainty estimation, and sensitivity analysis.</w:t>
+        <w:spacing w:before="0" w:beforeAutospacing="0" w:line="288" w:lineRule="auto"/>
+        <w:ind w:left="374"/>
+        <w:jc w:val="both"/>
+        <w:rPr>
+          <w:rFonts w:ascii="Arial" w:hAnsi="Arial" w:cs="Arial"/>
+          <w:sz w:val="20"/>
+          <w:szCs w:val="20"/>
+        </w:rPr>
+      </w:pPr>
+      <w:r>
+        <w:rPr>
+          <w:rFonts w:ascii="Arial" w:hAnsi="Arial" w:cs="Arial"/>
+          <w:sz w:val="20"/>
+          <w:szCs w:val="20"/>
+        </w:rPr>
+        <w:t>Developed ‘Antimicrobial Resistance Cartography’—a computational framework for modelling multivariate drug resistance and diversity patterns across microbial populations, integrating dimensionality reduction, imputation, and genotype–phenotype mapping.</w:t>
       </w:r>
     </w:p>
     <w:p>
@@ -1295,118 +1286,9 @@
           <w:sz w:val="20"/>
           <w:szCs w:val="20"/>
         </w:rPr>
-        <w:t xml:space="preserve">Quantified resistance </w:t>
-      </w:r>
-      <w:r>
-        <w:rPr>
-          <w:rFonts w:ascii="Arial" w:hAnsi="Arial" w:cs="Arial"/>
-          <w:sz w:val="20"/>
-          <w:szCs w:val="20"/>
-        </w:rPr>
-        <w:t xml:space="preserve">dynamics </w:t>
-      </w:r>
-      <w:r>
-        <w:rPr>
-          <w:rFonts w:ascii="Arial" w:hAnsi="Arial" w:cs="Arial"/>
-          <w:sz w:val="20"/>
-          <w:szCs w:val="20"/>
-        </w:rPr>
-        <w:t xml:space="preserve">across lineages </w:t>
-      </w:r>
-      <w:r>
-        <w:rPr>
-          <w:rFonts w:ascii="Arial" w:hAnsi="Arial" w:cs="Arial"/>
-          <w:sz w:val="20"/>
-          <w:szCs w:val="20"/>
-        </w:rPr>
-        <w:t xml:space="preserve">of </w:t>
-      </w:r>
-      <w:r>
-        <w:rPr>
-          <w:rStyle w:val="Emphasis"/>
-          <w:rFonts w:ascii="Arial" w:eastAsia="Arial" w:hAnsi="Arial" w:cs="Arial"/>
-          <w:sz w:val="20"/>
-          <w:szCs w:val="20"/>
-        </w:rPr>
-        <w:t>Streptococcus pneumoniae</w:t>
-      </w:r>
-      <w:r>
-        <w:rPr>
-          <w:rFonts w:ascii="Arial" w:hAnsi="Arial" w:cs="Arial"/>
-          <w:sz w:val="20"/>
-          <w:szCs w:val="20"/>
-        </w:rPr>
-        <w:t xml:space="preserve"> using </w:t>
-      </w:r>
-      <w:r>
-        <w:rPr>
-          <w:rFonts w:ascii="Arial" w:hAnsi="Arial" w:cs="Arial"/>
-          <w:sz w:val="20"/>
-          <w:szCs w:val="20"/>
-        </w:rPr>
-        <w:t xml:space="preserve">bespoke </w:t>
-      </w:r>
-      <w:r>
-        <w:rPr>
-          <w:rFonts w:ascii="Arial" w:hAnsi="Arial" w:cs="Arial"/>
-          <w:sz w:val="20"/>
-          <w:szCs w:val="20"/>
-        </w:rPr>
-        <w:t>statistical methods</w:t>
-      </w:r>
-      <w:r>
-        <w:rPr>
-          <w:rFonts w:ascii="Arial" w:hAnsi="Arial" w:cs="Arial"/>
-          <w:sz w:val="20"/>
-          <w:szCs w:val="20"/>
-        </w:rPr>
-        <w:t xml:space="preserve"> </w:t>
-      </w:r>
-      <w:hyperlink r:id="rId16" w:history="1">
-        <w:r>
-          <w:rPr>
-            <w:rStyle w:val="Hyperlink"/>
-            <w:rFonts w:ascii="Arial" w:hAnsi="Arial" w:cs="Arial"/>
-            <w:color w:val="0070C0"/>
-            <w:sz w:val="20"/>
-            <w:szCs w:val="20"/>
-          </w:rPr>
-          <w:t>developed in my thesis</w:t>
-        </w:r>
-      </w:hyperlink>
-      <w:r>
-        <w:rPr>
-          <w:rFonts w:ascii="Arial" w:hAnsi="Arial" w:cs="Arial"/>
-          <w:sz w:val="20"/>
-          <w:szCs w:val="20"/>
-        </w:rPr>
-        <w:t>.</w:t>
-      </w:r>
-    </w:p>
-    <w:p>
-      <w:pPr>
-        <w:pStyle w:val="p1"/>
-        <w:numPr>
-          <w:ilvl w:val="0"/>
-          <w:numId w:val="13"/>
-        </w:numPr>
-        <w:spacing w:before="0" w:beforeAutospacing="0" w:after="0" w:afterAutospacing="0" w:line="288" w:lineRule="auto"/>
-        <w:jc w:val="both"/>
-        <w:rPr>
-          <w:rFonts w:ascii="Arial" w:hAnsi="Arial" w:cs="Arial"/>
-          <w:sz w:val="20"/>
-          <w:szCs w:val="20"/>
-        </w:rPr>
-      </w:pPr>
-      <w:r>
-        <w:rPr>
-          <w:rFonts w:ascii="Arial" w:hAnsi="Arial" w:cs="Arial"/>
-          <w:sz w:val="20"/>
-          <w:szCs w:val="20"/>
-        </w:rPr>
         <w:t xml:space="preserve">Published in </w:t>
       </w:r>
-      <w:hyperlink r:id="rId17" w:history="1">
+      <w:hyperlink r:id="rId15" w:history="1">
         <w:r>
           <w:rPr>
             <w:rStyle w:val="Hyperlink"/>
@@ -1438,7 +1320,7 @@
         </w:rPr>
         <w:t xml:space="preserve"> </w:t>
       </w:r>
-      <w:hyperlink r:id="rId18" w:history="1">
+      <w:hyperlink r:id="rId16" w:history="1">
         <w:r>
           <w:rPr>
             <w:rStyle w:val="Hyperlink"/>
@@ -1462,7 +1344,7 @@
         </w:rPr>
         <w:t xml:space="preserve"> and </w:t>
       </w:r>
-      <w:hyperlink r:id="rId19" w:history="1">
+      <w:hyperlink r:id="rId17" w:history="1">
         <w:proofErr w:type="spellStart"/>
         <w:r>
           <w:rPr>
@@ -1692,6 +1574,77 @@
     </w:p>
     <w:p>
       <w:pPr>
+        <w:numPr>
+          <w:ilvl w:val="0"/>
+          <w:numId w:val="13"/>
+        </w:numPr>
+        <w:spacing w:after="0" w:line="288" w:lineRule="auto"/>
+        <w:ind w:right="6"/>
+        <w:rPr>
+          <w:rFonts w:cs="Arial"/>
+          <w:szCs w:val="20"/>
+        </w:rPr>
+      </w:pPr>
+      <w:r>
+        <w:rPr>
+          <w:rFonts w:cs="Arial"/>
+          <w:szCs w:val="20"/>
+        </w:rPr>
+        <w:t>Conducted 200-day experimental evolution project</w:t>
+      </w:r>
+      <w:r>
+        <w:rPr>
+          <w:rFonts w:cs="Arial"/>
+          <w:szCs w:val="20"/>
+        </w:rPr>
+        <w:t>, g</w:t>
+      </w:r>
+      <w:r>
+        <w:rPr>
+          <w:rFonts w:cs="Arial"/>
+          <w:szCs w:val="20"/>
+        </w:rPr>
+        <w:t>enerat</w:t>
+      </w:r>
+      <w:r>
+        <w:rPr>
+          <w:rFonts w:cs="Arial"/>
+          <w:szCs w:val="20"/>
+        </w:rPr>
+        <w:t xml:space="preserve">ing </w:t>
+      </w:r>
+      <w:r>
+        <w:rPr>
+          <w:rFonts w:cs="Arial"/>
+          <w:szCs w:val="20"/>
+        </w:rPr>
+        <w:t xml:space="preserve">291 mutant </w:t>
+      </w:r>
+      <w:r>
+        <w:rPr>
+          <w:rFonts w:cs="Arial"/>
+          <w:i/>
+          <w:szCs w:val="20"/>
+        </w:rPr>
+        <w:t>Streptococcus suis</w:t>
+      </w:r>
+      <w:r>
+        <w:rPr>
+          <w:rFonts w:cs="Arial"/>
+          <w:szCs w:val="20"/>
+        </w:rPr>
+        <w:t xml:space="preserve"> lines.</w:t>
+      </w:r>
+      <w:r>
+        <w:rPr>
+          <w:rFonts w:cs="Arial"/>
+          <w:szCs w:val="20"/>
+        </w:rPr>
+        <w:t xml:space="preserve">   </w:t>
+      </w:r>
+    </w:p>
+    <w:p>
+      <w:pPr>
         <w:pStyle w:val="p1"/>
         <w:numPr>
           <w:ilvl w:val="0"/>
@@ -1777,18 +1730,6 @@
         <w:spacing w:after="0" w:line="288" w:lineRule="auto"/>
         <w:ind w:left="15" w:firstLine="0"/>
       </w:pPr>
-      <w:r>
-        <w:rPr>
-          <w:rFonts w:cs="Arial"/>
-          <w:b/>
-          <w:color w:val="0070C0"/>
-          <w:sz w:val="22"/>
-        </w:rPr>
-        <w:t xml:space="preserve"> </w:t>
-      </w:r>
-      <w:r>
-        <w:t xml:space="preserve"> </w:t>
-      </w:r>
     </w:p>
     <w:p>
       <w:pPr>
@@ -1932,7 +1873,7 @@
       <w:r>
         <w:t xml:space="preserve"> </w:t>
       </w:r>
-      <w:hyperlink r:id="rId20">
+      <w:hyperlink r:id="rId18">
         <w:r>
           <w:rPr>
             <w:color w:val="0070C0"/>
@@ -1941,7 +1882,7 @@
           <w:t>conferenc</w:t>
         </w:r>
       </w:hyperlink>
-      <w:hyperlink r:id="rId21">
+      <w:hyperlink r:id="rId19">
         <w:r>
           <w:rPr>
             <w:color w:val="0070C0"/>
@@ -1950,7 +1891,7 @@
           <w:t>e</w:t>
         </w:r>
       </w:hyperlink>
-      <w:hyperlink r:id="rId22">
+      <w:hyperlink r:id="rId20">
         <w:r>
           <w:rPr>
             <w:color w:val="0070C0"/>
@@ -1958,7 +1899,7 @@
           <w:t xml:space="preserve"> </w:t>
         </w:r>
       </w:hyperlink>
-      <w:hyperlink r:id="rId23">
+      <w:hyperlink r:id="rId21">
         <w:r>
           <w:t>w</w:t>
         </w:r>
@@ -2214,7 +2155,7 @@
           <w:lang w:val="en-US" w:eastAsia="en-US"/>
           <w14:ligatures w14:val="none"/>
         </w:rPr>
-        <w:t xml:space="preserve"> with University of Leeds Partnership Award for Innovation</w:t>
+        <w:t xml:space="preserve"> University of Leeds Partnership Award for Innovation</w:t>
       </w:r>
       <w:r>
         <w:rPr>
@@ -2414,7 +2355,29 @@
           <w14:ligatures w14:val="none"/>
         </w:rPr>
         <w:lastRenderedPageBreak/>
-        <w:t>Advanced statistical modeling: multivariate analysis, MDS, machine learning, model fitting</w:t>
+        <w:t xml:space="preserve">Advanced statistical modeling: </w:t>
+      </w:r>
+      <w:r>
+        <w:rPr>
+          <w:rFonts w:eastAsia="Times New Roman" w:cs="Arial"/>
+          <w:color w:val="auto"/>
+          <w:kern w:val="0"/>
+          <w:szCs w:val="20"/>
+          <w:lang w:val="en-US" w:eastAsia="en-US"/>
+          <w14:ligatures w14:val="none"/>
+        </w:rPr>
+        <w:t xml:space="preserve">Genotype-phenotype association, </w:t>
+      </w:r>
+      <w:r>
+        <w:rPr>
+          <w:rFonts w:eastAsia="Times New Roman" w:cs="Arial"/>
+          <w:color w:val="auto"/>
+          <w:kern w:val="0"/>
+          <w:szCs w:val="20"/>
+          <w:lang w:val="en-US" w:eastAsia="en-US"/>
+          <w14:ligatures w14:val="none"/>
+        </w:rPr>
+        <w:t>multivariate analysis, MDS, machine learning, model fitting</w:t>
       </w:r>
       <w:r>
         <w:rPr>
@@ -2562,6 +2525,83 @@
     </w:p>
     <w:p>
       <w:pPr>
+        <w:pStyle w:val="ListParagraph"/>
+        <w:numPr>
+          <w:ilvl w:val="0"/>
+          <w:numId w:val="29"/>
+        </w:numPr>
+        <w:spacing w:after="0" w:line="288" w:lineRule="auto"/>
+        <w:ind w:left="389"/>
+        <w:jc w:val="left"/>
+        <w:rPr>
+          <w:rFonts w:eastAsia="Times New Roman" w:cs="Arial"/>
+          <w:color w:val="0E0E0E"/>
+          <w:kern w:val="0"/>
+          <w:szCs w:val="20"/>
+          <w:lang w:val="en-US" w:eastAsia="en-US"/>
+          <w14:ligatures w14:val="none"/>
+        </w:rPr>
+      </w:pPr>
+      <w:r>
+        <w:rPr>
+          <w:rFonts w:eastAsia="Times New Roman" w:cs="Arial"/>
+          <w:color w:val="0E0E0E"/>
+          <w:kern w:val="0"/>
+          <w:szCs w:val="20"/>
+          <w:lang w:val="en-US" w:eastAsia="en-US"/>
+          <w14:ligatures w14:val="none"/>
+        </w:rPr>
+        <w:t xml:space="preserve">Familiarity with </w:t>
+      </w:r>
+      <w:r>
+        <w:rPr>
+          <w:rFonts w:eastAsia="Times New Roman" w:cs="Arial"/>
+          <w:color w:val="0E0E0E"/>
+          <w:kern w:val="0"/>
+          <w:szCs w:val="20"/>
+          <w:lang w:val="en-US" w:eastAsia="en-US"/>
+          <w14:ligatures w14:val="none"/>
+        </w:rPr>
+        <w:t>challenges</w:t>
+      </w:r>
+      <w:r>
+        <w:rPr>
+          <w:rFonts w:eastAsia="Times New Roman" w:cs="Arial"/>
+          <w:color w:val="0E0E0E"/>
+          <w:kern w:val="0"/>
+          <w:szCs w:val="20"/>
+          <w:lang w:val="en-US" w:eastAsia="en-US"/>
+          <w14:ligatures w14:val="none"/>
+        </w:rPr>
+        <w:t xml:space="preserve"> in metagenomics (community diversity, taxonomic profiling, mixed-sample interpretation) and experience </w:t>
+      </w:r>
+      <w:proofErr w:type="spellStart"/>
+      <w:r>
+        <w:rPr>
+          <w:rFonts w:eastAsia="Times New Roman" w:cs="Arial"/>
+          <w:color w:val="0E0E0E"/>
+          <w:kern w:val="0"/>
+          <w:szCs w:val="20"/>
+          <w:lang w:val="en-US" w:eastAsia="en-US"/>
+          <w14:ligatures w14:val="none"/>
+        </w:rPr>
+        <w:t>analysing</w:t>
+      </w:r>
+      <w:proofErr w:type="spellEnd"/>
+      <w:r>
+        <w:rPr>
+          <w:rFonts w:eastAsia="Times New Roman" w:cs="Arial"/>
+          <w:color w:val="0E0E0E"/>
+          <w:kern w:val="0"/>
+          <w:szCs w:val="20"/>
+          <w:lang w:val="en-US" w:eastAsia="en-US"/>
+          <w14:ligatures w14:val="none"/>
+        </w:rPr>
+        <w:t xml:space="preserve"> heterogeneous microbial datasets at scale.</w:t>
+      </w:r>
+    </w:p>
+    <w:p>
+      <w:pPr>
         <w:spacing w:after="0" w:line="288" w:lineRule="auto"/>
         <w:ind w:right="6"/>
         <w:rPr>
@@ -2618,7 +2658,7 @@
           <w:sz w:val="20"/>
           <w:szCs w:val="20"/>
         </w:rPr>
-        <w:t xml:space="preserve">Coordinated multi-partner projects on antimalarial resistance genomics, managing timelines and deliverables across </w:t>
+        <w:t xml:space="preserve">Coordinated multi-partner projects on malaria genomics, managing timelines and deliverables across </w:t>
       </w:r>
       <w:r>
         <w:rPr>
@@ -2789,7 +2829,7 @@
       <w:r>
         <w:t xml:space="preserve">in </w:t>
       </w:r>
-      <w:hyperlink r:id="rId24">
+      <w:hyperlink r:id="rId22">
         <w:r>
           <w:rPr>
             <w:color w:val="0070C0"/>
@@ -2798,7 +2838,7 @@
           <w:t>Scientific America</w:t>
         </w:r>
       </w:hyperlink>
-      <w:hyperlink r:id="rId25">
+      <w:hyperlink r:id="rId23">
         <w:r>
           <w:rPr>
             <w:color w:val="0070C0"/>
@@ -2807,12 +2847,12 @@
           <w:t>n</w:t>
         </w:r>
       </w:hyperlink>
-      <w:hyperlink r:id="rId26">
+      <w:hyperlink r:id="rId24">
         <w:r>
           <w:t xml:space="preserve"> </w:t>
         </w:r>
       </w:hyperlink>
-      <w:hyperlink r:id="rId27">
+      <w:hyperlink r:id="rId25">
         <w:r>
           <w:t>a</w:t>
         </w:r>
@@ -3121,7 +3161,7 @@
         </w:rPr>
         <w:t xml:space="preserve"> </w:t>
       </w:r>
-      <w:hyperlink r:id="rId28">
+      <w:hyperlink r:id="rId26">
         <w:r>
           <w:rPr>
             <w:rFonts w:cs="Arial"/>
@@ -3132,7 +3172,7 @@
           <w:t>‘Postgraduate Search</w:t>
         </w:r>
       </w:hyperlink>
-      <w:hyperlink r:id="rId29">
+      <w:hyperlink r:id="rId27">
         <w:r>
           <w:rPr>
             <w:rFonts w:cs="Arial"/>
@@ -3420,7 +3460,7 @@
         </w:rPr>
         <w:t xml:space="preserve">). </w:t>
       </w:r>
-      <w:hyperlink r:id="rId30" w:history="1">
+      <w:hyperlink r:id="rId28" w:history="1">
         <w:r>
           <w:rPr>
             <w:rStyle w:val="Hyperlink"/>
@@ -3523,7 +3563,7 @@
         </w:rPr>
         <w:t xml:space="preserve">, et al., (2025). </w:t>
       </w:r>
-      <w:hyperlink r:id="rId31" w:history="1">
+      <w:hyperlink r:id="rId29" w:history="1">
         <w:r>
           <w:rPr>
             <w:rStyle w:val="Hyperlink"/>
@@ -3800,7 +3840,7 @@
         </w:rPr>
         <w:t xml:space="preserve"> </w:t>
       </w:r>
-      <w:hyperlink r:id="rId32" w:history="1">
+      <w:hyperlink r:id="rId30" w:history="1">
         <w:r>
           <w:rPr>
             <w:rStyle w:val="Hyperlink"/>
@@ -3955,7 +3995,7 @@
         </w:rPr>
         <w:t xml:space="preserve"> </w:t>
       </w:r>
-      <w:hyperlink r:id="rId33" w:history="1">
+      <w:hyperlink r:id="rId31" w:history="1">
         <w:r>
           <w:rPr>
             <w:rStyle w:val="Hyperlink"/>
@@ -4166,7 +4206,7 @@
         </w:rPr>
         <w:t xml:space="preserve">) </w:t>
       </w:r>
-      <w:hyperlink r:id="rId34" w:history="1">
+      <w:hyperlink r:id="rId32" w:history="1">
         <w:r>
           <w:rPr>
             <w:rStyle w:val="Hyperlink"/>
@@ -4275,12 +4315,30 @@
         </w:rPr>
         <w:t xml:space="preserve"> </w:t>
       </w:r>
-      <w:hyperlink r:id="rId35">
+      <w:hyperlink r:id="rId33">
         <w:r>
           <w:rPr>
             <w:szCs w:val="20"/>
           </w:rPr>
           <w:t>‘</w:t>
+        </w:r>
+      </w:hyperlink>
+      <w:hyperlink r:id="rId34">
+        <w:r>
+          <w:rPr>
+            <w:color w:val="0070C0"/>
+            <w:szCs w:val="20"/>
+          </w:rPr>
+          <w:t xml:space="preserve">Mutation rate </w:t>
+        </w:r>
+      </w:hyperlink>
+      <w:hyperlink r:id="rId35">
+        <w:r>
+          <w:rPr>
+            <w:color w:val="0070C0"/>
+            <w:szCs w:val="20"/>
+          </w:rPr>
+          <w:t>dynamics reflect ecological changes in an emerging zoonotic pathogen</w:t>
         </w:r>
       </w:hyperlink>
       <w:hyperlink r:id="rId36">
@@ -4289,28 +4347,10 @@
             <w:color w:val="0070C0"/>
             <w:szCs w:val="20"/>
           </w:rPr>
-          <w:t xml:space="preserve">Mutation rate </w:t>
+          <w:t>’</w:t>
         </w:r>
       </w:hyperlink>
       <w:hyperlink r:id="rId37">
-        <w:r>
-          <w:rPr>
-            <w:color w:val="0070C0"/>
-            <w:szCs w:val="20"/>
-          </w:rPr>
-          <w:t>dynamics reflect ecological changes in an emerging zoonotic pathogen</w:t>
-        </w:r>
-      </w:hyperlink>
-      <w:hyperlink r:id="rId38">
-        <w:r>
-          <w:rPr>
-            <w:color w:val="0070C0"/>
-            <w:szCs w:val="20"/>
-          </w:rPr>
-          <w:t>’</w:t>
-        </w:r>
-      </w:hyperlink>
-      <w:hyperlink r:id="rId39">
         <w:r>
           <w:rPr>
             <w:szCs w:val="20"/>
@@ -4318,7 +4358,7 @@
           <w:t>.</w:t>
         </w:r>
       </w:hyperlink>
-      <w:hyperlink r:id="rId40">
+      <w:hyperlink r:id="rId38">
         <w:r>
           <w:rPr>
             <w:color w:val="202020"/>
@@ -4327,7 +4367,7 @@
           <w:t xml:space="preserve"> </w:t>
         </w:r>
       </w:hyperlink>
-      <w:hyperlink r:id="rId41">
+      <w:hyperlink r:id="rId39">
         <w:r>
           <w:rPr>
             <w:color w:val="202020"/>
@@ -4343,7 +4383,7 @@
         </w:rPr>
         <w:t>LOS Genetics.</w:t>
       </w:r>
-      <w:hyperlink r:id="rId42">
+      <w:hyperlink r:id="rId40">
         <w:r>
           <w:rPr>
             <w:color w:val="202020"/>
@@ -4467,7 +4507,7 @@
         </w:rPr>
         <w:t>‘</w:t>
       </w:r>
-      <w:hyperlink r:id="rId43" w:history="1">
+      <w:hyperlink r:id="rId41" w:history="1">
         <w:r>
           <w:rPr>
             <w:rStyle w:val="Hyperlink"/>
@@ -4807,6 +4847,13 @@
         </w:rPr>
         <w:t>.</w:t>
       </w:r>
+      <w:r>
+        <w:rPr>
+          <w:rFonts w:cs="Arial"/>
+          <w:bCs/>
+        </w:rPr>
+        <w:t xml:space="preserve"> </w:t>
+      </w:r>
     </w:p>
     <w:p>
       <w:pPr>
@@ -4817,6 +4864,9 @@
         </w:numPr>
         <w:spacing w:after="0" w:line="288" w:lineRule="auto"/>
         <w:ind w:right="6"/>
+        <w:rPr>
+          <w:bCs/>
+        </w:rPr>
       </w:pPr>
       <w:proofErr w:type="spellStart"/>
       <w:r>
@@ -4824,242 +4874,50 @@
       </w:r>
       <w:proofErr w:type="spellEnd"/>
       <w:r>
-        <w:t xml:space="preserve"> and presented lectures on science communication (University of Leeds)</w:t>
-      </w:r>
-      <w:r>
+        <w:t xml:space="preserve"> and presented </w:t>
+      </w:r>
+      <w:r>
+        <w:t xml:space="preserve">a series of </w:t>
+      </w:r>
+      <w:r>
+        <w:t>lectures</w:t>
+      </w:r>
+      <w:r>
+        <w:t xml:space="preserve"> and podcasts</w:t>
+      </w:r>
+      <w:r>
+        <w:t xml:space="preserve"> on science communication </w:t>
+      </w:r>
+      <w:r>
+        <w:t>(</w:t>
+      </w:r>
+      <w:r>
+        <w:rPr>
+          <w:rFonts w:cs="Arial"/>
+        </w:rPr>
+        <w:t>2013).</w:t>
+      </w:r>
+      <w:r>
+        <w:rPr>
+          <w:rFonts w:cs="Arial"/>
+        </w:rPr>
         <w:t xml:space="preserve"> </w:t>
       </w:r>
       <w:r>
-        <w:t>(</w:t>
-      </w:r>
-      <w:r>
-        <w:rPr>
-          <w:rFonts w:cs="Arial"/>
-        </w:rPr>
-        <w:t>2013)</w:t>
-      </w:r>
-      <w:r>
-        <w:rPr>
-          <w:rFonts w:cs="Arial"/>
-        </w:rPr>
-        <w:t>.</w:t>
-      </w:r>
-      <w:r>
-        <w:t xml:space="preserve">   </w:t>
+        <w:t xml:space="preserve"> </w:t>
       </w:r>
     </w:p>
     <w:p>
       <w:pPr>
         <w:spacing w:after="0" w:line="288" w:lineRule="auto"/>
-        <w:ind w:left="15" w:firstLine="0"/>
-      </w:pPr>
-      <w:r>
-        <w:rPr>
-          <w:rFonts w:cs="Arial"/>
-          <w:b/>
-          <w:color w:val="0070C0"/>
-        </w:rPr>
-        <w:t xml:space="preserve"> </w:t>
-      </w:r>
-      <w:r>
-        <w:t xml:space="preserve"> </w:t>
-      </w:r>
-    </w:p>
-    <w:p>
-      <w:pPr>
-        <w:pStyle w:val="Heading2"/>
-        <w:tabs>
-          <w:tab w:val="center" w:pos="1456"/>
-          <w:tab w:val="center" w:pos="2176"/>
-          <w:tab w:val="center" w:pos="2897"/>
-          <w:tab w:val="center" w:pos="3617"/>
-          <w:tab w:val="center" w:pos="4337"/>
-          <w:tab w:val="center" w:pos="5057"/>
-          <w:tab w:val="center" w:pos="5783"/>
-          <w:tab w:val="center" w:pos="6503"/>
-          <w:tab w:val="center" w:pos="7223"/>
-          <w:tab w:val="center" w:pos="7944"/>
-          <w:tab w:val="center" w:pos="8664"/>
-        </w:tabs>
-        <w:spacing w:after="0" w:line="288" w:lineRule="auto"/>
-        <w:ind w:left="0" w:firstLine="0"/>
-        <w:jc w:val="both"/>
-      </w:pPr>
-      <w:r>
-        <w:t xml:space="preserve">Referees  </w:t>
-      </w:r>
-      <w:r>
-        <w:tab/>
-        <w:t xml:space="preserve">  </w:t>
-      </w:r>
-      <w:r>
-        <w:tab/>
-        <w:t xml:space="preserve">  </w:t>
-      </w:r>
-      <w:r>
-        <w:tab/>
-        <w:t xml:space="preserve">  </w:t>
-      </w:r>
-      <w:r>
-        <w:tab/>
-        <w:t xml:space="preserve">  </w:t>
-      </w:r>
-      <w:r>
-        <w:tab/>
-        <w:t xml:space="preserve">  </w:t>
-      </w:r>
-      <w:r>
-        <w:tab/>
-        <w:t xml:space="preserve">  </w:t>
-      </w:r>
-      <w:r>
-        <w:tab/>
-        <w:t xml:space="preserve">  </w:t>
-      </w:r>
-      <w:r>
-        <w:tab/>
-        <w:t xml:space="preserve">  </w:t>
-      </w:r>
-      <w:r>
-        <w:tab/>
-        <w:t xml:space="preserve">  </w:t>
-      </w:r>
-      <w:r>
-        <w:tab/>
-        <w:t xml:space="preserve">  </w:t>
-      </w:r>
-      <w:r>
-        <w:tab/>
-      </w:r>
-      <w:r>
-        <w:rPr>
-          <w:u w:val="none" w:color="000000"/>
-        </w:rPr>
-        <w:t xml:space="preserve">  </w:t>
-      </w:r>
-    </w:p>
-    <w:p>
-      <w:pPr>
-        <w:pStyle w:val="ListParagraph"/>
-        <w:numPr>
-          <w:ilvl w:val="0"/>
-          <w:numId w:val="23"/>
-        </w:numPr>
-        <w:spacing w:after="0" w:line="288" w:lineRule="auto"/>
         <w:ind w:right="6"/>
-      </w:pPr>
-      <w:r>
-        <w:t>Dr Richard Pearson. Current line manager</w:t>
-      </w:r>
-      <w:r>
-        <w:t xml:space="preserve">, Wellcome Sanger Institute </w:t>
-      </w:r>
-      <w:hyperlink r:id="rId44" w:history="1">
-        <w:r>
-          <w:rPr>
-            <w:rStyle w:val="Hyperlink"/>
-          </w:rPr>
-          <w:t>(</w:t>
-        </w:r>
-      </w:hyperlink>
-      <w:r>
-        <w:rPr>
-          <w:color w:val="0563C1"/>
-          <w:u w:val="single" w:color="0563C1"/>
-        </w:rPr>
-        <w:t>rp7@sanger.ac.uk</w:t>
-      </w:r>
-      <w:r>
-        <w:t>)</w:t>
-      </w:r>
-    </w:p>
-    <w:p>
-      <w:pPr>
-        <w:pStyle w:val="ListParagraph"/>
-        <w:numPr>
-          <w:ilvl w:val="0"/>
-          <w:numId w:val="23"/>
-        </w:numPr>
-        <w:spacing w:after="0" w:line="288" w:lineRule="auto"/>
-        <w:ind w:right="6"/>
-      </w:pPr>
-      <w:r>
-        <w:rPr>
-          <w:color w:val="0563C1"/>
-          <w:u w:val="single" w:color="0563C1"/>
-        </w:rPr>
-        <w:t xml:space="preserve">Dr. Olivier </w:t>
-      </w:r>
-      <w:proofErr w:type="spellStart"/>
-      <w:r>
-        <w:rPr>
-          <w:color w:val="0563C1"/>
-          <w:u w:val="single" w:color="0563C1"/>
-        </w:rPr>
-        <w:t>Restif</w:t>
-      </w:r>
-      <w:proofErr w:type="spellEnd"/>
-      <w:r>
-        <w:t xml:space="preserve"> and </w:t>
-      </w:r>
-      <w:hyperlink r:id="rId45">
-        <w:r>
-          <w:rPr>
-            <w:color w:val="0563C1"/>
-            <w:u w:val="single" w:color="0563C1"/>
-          </w:rPr>
-          <w:t>Dr. Lucy Weiner</w:t>
-        </w:r>
-      </w:hyperlink>
-      <w:hyperlink r:id="rId46">
-        <w:r>
-          <w:rPr>
-            <w:color w:val="0563C1"/>
-            <w:u w:val="single" w:color="0563C1"/>
-          </w:rPr>
-          <w:t>t</w:t>
-        </w:r>
-      </w:hyperlink>
-      <w:r>
-        <w:t xml:space="preserve">. </w:t>
-      </w:r>
-      <w:r>
-        <w:t>Doctoral study co-supervisors, Department of Veterinary Medicine, University of Cambridge</w:t>
-      </w:r>
-      <w:hyperlink r:id="rId47" w:history="1">
-        <w:r>
-          <w:rPr>
-            <w:rStyle w:val="Hyperlink"/>
-          </w:rPr>
-          <w:t xml:space="preserve"> (</w:t>
-        </w:r>
-      </w:hyperlink>
-      <w:r>
-        <w:rPr>
-          <w:color w:val="0563C1"/>
-          <w:u w:val="single" w:color="0563C1"/>
-        </w:rPr>
-        <w:t>or226@cam.ac.uk</w:t>
-      </w:r>
-      <w:r>
-        <w:t>/</w:t>
-      </w:r>
-      <w:r>
-        <w:rPr>
-          <w:color w:val="0563C1"/>
-          <w:u w:val="single" w:color="0563C1"/>
-        </w:rPr>
-        <w:t>lw461@cam.ac.uk</w:t>
-      </w:r>
-      <w:r>
-        <w:t>)</w:t>
-      </w:r>
-      <w:r>
-        <w:t xml:space="preserve">.  </w:t>
-      </w:r>
+        <w:rPr>
+          <w:bCs/>
+        </w:rPr>
+      </w:pPr>
     </w:p>
     <w:sectPr>
-      <w:footerReference w:type="default" r:id="rId48"/>
+      <w:footerReference w:type="default" r:id="rId42"/>
       <w:pgSz w:w="11900" w:h="16840"/>
       <w:pgMar w:top="1096" w:right="1399" w:bottom="423" w:left="1406" w:header="720" w:footer="720" w:gutter="0"/>
       <w:cols w:space="720"/>
@@ -10256,11 +10114,6 @@
       <w:bCs/>
     </w:rPr>
   </w:style>
-  <w:style w:type="character" w:customStyle="1" w:styleId="apple-tab-span">
-    <w:name w:val="apple-tab-span"/>
-    <w:basedOn w:val="DefaultParagraphFont"/>
-    <w:rsid w:val="00197A6D"/>
-  </w:style>
 </w:styles>
 </file>
 

</xml_diff>